<commit_message>
Reframe MER manuscript around ecological hypotheses
</commit_message>
<xml_diff>
--- a/manuscript/journal_submission/marine_environmental_research/rendered/mer_cover_letter_v2.docx
+++ b/manuscript/journal_submission/marine_environmental_research/rendered/mer_cover_letter_v2.docx
@@ -62,7 +62,7 @@
         <w:t xml:space="preserve">Marine Environmental Research</w:t>
       </w:r>
       <w:r>
-        <w:t xml:space="preserve">. Pacific herring spawning creates a brief coastal resource pulse, and the study links effort-aware complete eBird checklists to event-level Fisheries and Oceans Canada spawn information to estimate checklist detection and positive numeric-count associations with recorded local exposure.</w:t>
+        <w:t xml:space="preserve">. We ask whether the short-lived Pacific herring spawn pulse produces a spatially local, temporally structured, and taxon-specific signature in coastal bird checklists. The study links effort-aware complete eBird checklists to event-level Fisheries and Oceans Canada spawn information and tests biologically motivated predictions using registered analyses.</w:t>
       </w:r>
     </w:p>
     <w:p>
@@ -70,22 +70,7 @@
         <w:pStyle w:val="BodyText"/>
       </w:pPr>
       <w:r>
-        <w:t xml:space="preserve">The registered Stage 4A core provides confirmatory observational evidence. The analysis preserves concurrent event links without duplicating checklists and keeps detection, numeric counts, and unquantified</w:t>
-      </w:r>
-      <w:r>
-        <w:t xml:space="preserve"> </w:t>
-      </w:r>
-      <w:r>
-        <w:rPr>
-          <w:rStyle w:val="VerbatimChar"/>
-        </w:rPr>
-        <w:t xml:space="preserve">X</w:t>
-      </w:r>
-      <w:r>
-        <w:t xml:space="preserve"> </w:t>
-      </w:r>
-      <w:r>
-        <w:t xml:space="preserve">records distinct. Historical partial pooling was repaired using compatible family identities while preserving every individual estimate, confidence interval, p-value, and model-specific Benjamini-Hochberg q-value. The complete submission reports matched whole-bundle placebos, WCVI spatial and observer sensitivities, blocked validation, and all singular-fit warnings.</w:t>
+        <w:t xml:space="preserve">The results provide a partial and qualified resource-pulse answer. Surf Scoter and Short-billed Gull showed the clearest cross-region consistency, with positive detection and conditional-count coefficients in both primary regions. Guild responses were heterogeneous, and event-window coefficients did not form one community-wide trajectory. Matched WCVI spatial and observer sensitivities preserved most directions, and response-blind shifted-exposure placebos were null after Benjamini-Hochberg adjustment.</w:t>
       </w:r>
     </w:p>
     <w:p>
@@ -93,7 +78,7 @@
         <w:pStyle w:val="BodyText"/>
       </w:pPr>
       <w:r>
-        <w:t xml:space="preserve">The manuscript prominently reports a non-null prespecified Strait of Georgia specificity panel. That result constrains causal and simple ecological-specificity interpretations without erasing the checklist-conditional associations or directly testing conditional positive-count responses. The paper therefore presents both the substantive ecological pattern and the observation-process alternatives needed for a balanced interpretation.</w:t>
+        <w:t xml:space="preserve">The manuscript prominently reports a non-null prespecified Strait of Georgia specificity panel. That result constrains causal and simple ecological-specificity interpretations without erasing the checklist-conditional associations or directly testing conditional positive-count responses. The paper therefore presents the ecological signal, its taxonomic and regional heterogeneity, and the observation-process alternatives needed for a balanced interpretation.</w:t>
       </w:r>
     </w:p>
     <w:p>

</xml_diff>